<commit_message>
fix(teacher): split matrix Word 'Tổng số câu/ý' column into Biết/Hiểu/VD
</commit_message>
<xml_diff>
--- a/teacher/data/template_matran.docx
+++ b/teacher/data/template_matran.docx
@@ -76,17 +76,19 @@
     </w:p>
     <w:tbl>
       <w:tblGrid>
-        <w:gridCol w:w="3353" w:type="dxa"/>
-        <w:gridCol w:w="870" w:type="dxa"/>
-        <w:gridCol w:w="870" w:type="dxa"/>
-        <w:gridCol w:w="870" w:type="dxa"/>
-        <w:gridCol w:w="870" w:type="dxa"/>
-        <w:gridCol w:w="869" w:type="dxa"/>
-        <w:gridCol w:w="869" w:type="dxa"/>
-        <w:gridCol w:w="869" w:type="dxa"/>
-        <w:gridCol w:w="869" w:type="dxa"/>
-        <w:gridCol w:w="869" w:type="dxa"/>
-        <w:gridCol w:w="1400" w:type="dxa"/>
+        <w:gridCol w:w="2800" w:type="dxa"/>
+        <w:gridCol w:w="804" w:type="dxa"/>
+        <w:gridCol w:w="803" w:type="dxa"/>
+        <w:gridCol w:w="803" w:type="dxa"/>
+        <w:gridCol w:w="803" w:type="dxa"/>
+        <w:gridCol w:w="803" w:type="dxa"/>
+        <w:gridCol w:w="803" w:type="dxa"/>
+        <w:gridCol w:w="803" w:type="dxa"/>
+        <w:gridCol w:w="803" w:type="dxa"/>
+        <w:gridCol w:w="803" w:type="dxa"/>
+        <w:gridCol w:w="850" w:type="dxa"/>
+        <w:gridCol w:w="850" w:type="dxa"/>
+        <w:gridCol w:w="850" w:type="dxa"/>
         <w:gridCol w:w="1400" w:type="dxa"/>
         <w:gridCol w:w="700" w:type="dxa"/>
       </w:tblGrid>
@@ -114,7 +116,7 @@
         </w:trPr>
         <w:tc>
           <w:tcPr>
-            <w:tcW w:w="3353" w:type="dxa"/>
+            <w:tcW w:w="2800" w:type="dxa"/>
             <w:vAlign w:val="center"/>
             <w:tcBorders>
               <w:top w:val="single" w:sz="8" w:color="000000"/>
@@ -144,7 +146,7 @@
         </w:tc>
         <w:tc>
           <w:tcPr>
-            <w:tcW w:w="2610" w:type="dxa"/>
+            <w:tcW w:w="2410" w:type="dxa"/>
             <w:vAlign w:val="center"/>
             <w:tcBorders>
               <w:top w:val="single" w:sz="8" w:color="000000"/>
@@ -190,7 +192,7 @@
         </w:tc>
         <w:tc>
           <w:tcPr>
-            <w:tcW w:w="2608" w:type="dxa"/>
+            <w:tcW w:w="2409" w:type="dxa"/>
             <w:vAlign w:val="center"/>
             <w:tcBorders>
               <w:top w:val="single" w:sz="8" w:color="000000"/>
@@ -230,13 +232,13 @@
                 <w:b w:val="1"/>
                 <w:bCs w:val="1"/>
               </w:rPr>
-              <w:t xml:space="preserve">(0.25đ/ý)</w:t>
-            </w:r>
-          </w:p>
-        </w:tc>
-        <w:tc>
-          <w:tcPr>
-            <w:tcW w:w="2607" w:type="dxa"/>
+              <w:t xml:space="preserve">(${ds_pt_item}đ/ý)</w:t>
+            </w:r>
+          </w:p>
+        </w:tc>
+        <w:tc>
+          <w:tcPr>
+            <w:tcW w:w="2409" w:type="dxa"/>
             <w:vAlign w:val="center"/>
             <w:tcBorders>
               <w:top w:val="single" w:sz="8" w:color="000000"/>
@@ -266,15 +268,15 @@
         </w:tc>
         <w:tc>
           <w:tcPr>
-            <w:tcW w:w="1400" w:type="dxa"/>
-            <w:vAlign w:val="center"/>
-            <w:tcBorders>
-              <w:top w:val="single" w:sz="8" w:color="000000"/>
-              <w:left w:val="single" w:sz="8" w:color="000000"/>
-              <w:right w:val="single" w:sz="8" w:color="000000"/>
-              <w:bottom w:val="single" w:sz="8" w:color="000000"/>
-            </w:tcBorders>
-            <w:vMerge w:val="restart"/>
+            <w:tcW w:w="2550" w:type="dxa"/>
+            <w:vAlign w:val="center"/>
+            <w:tcBorders>
+              <w:top w:val="single" w:sz="8" w:color="000000"/>
+              <w:left w:val="single" w:sz="8" w:color="000000"/>
+              <w:right w:val="single" w:sz="8" w:color="000000"/>
+              <w:bottom w:val="single" w:sz="8" w:color="000000"/>
+            </w:tcBorders>
+            <w:gridSpan w:val="3"/>
             <w:noWrap/>
           </w:tcPr>
           <w:p>
@@ -361,7 +363,7 @@
         </w:trPr>
         <w:tc>
           <w:tcPr>
-            <w:tcW w:w="3353" w:type="dxa"/>
+            <w:tcW w:w="2800" w:type="dxa"/>
             <w:tcBorders>
               <w:top w:val="single" w:sz="8" w:color="000000"/>
               <w:left w:val="single" w:sz="8" w:color="000000"/>
@@ -375,7 +377,7 @@
         </w:tc>
         <w:tc>
           <w:tcPr>
-            <w:tcW w:w="870" w:type="dxa"/>
+            <w:tcW w:w="804" w:type="dxa"/>
             <w:vAlign w:val="center"/>
             <w:tcBorders>
               <w:top w:val="single" w:sz="8" w:color="000000"/>
@@ -404,7 +406,7 @@
         </w:tc>
         <w:tc>
           <w:tcPr>
-            <w:tcW w:w="870" w:type="dxa"/>
+            <w:tcW w:w="803" w:type="dxa"/>
             <w:vAlign w:val="center"/>
             <w:tcBorders>
               <w:top w:val="single" w:sz="8" w:color="000000"/>
@@ -433,7 +435,7 @@
         </w:tc>
         <w:tc>
           <w:tcPr>
-            <w:tcW w:w="870" w:type="dxa"/>
+            <w:tcW w:w="803" w:type="dxa"/>
             <w:vAlign w:val="center"/>
             <w:tcBorders>
               <w:top w:val="single" w:sz="8" w:color="000000"/>
@@ -462,7 +464,7 @@
         </w:tc>
         <w:tc>
           <w:tcPr>
-            <w:tcW w:w="870" w:type="dxa"/>
+            <w:tcW w:w="803" w:type="dxa"/>
             <w:vAlign w:val="center"/>
             <w:tcBorders>
               <w:top w:val="single" w:sz="8" w:color="000000"/>
@@ -491,7 +493,7 @@
         </w:tc>
         <w:tc>
           <w:tcPr>
-            <w:tcW w:w="869" w:type="dxa"/>
+            <w:tcW w:w="803" w:type="dxa"/>
             <w:vAlign w:val="center"/>
             <w:tcBorders>
               <w:top w:val="single" w:sz="8" w:color="000000"/>
@@ -520,7 +522,7 @@
         </w:tc>
         <w:tc>
           <w:tcPr>
-            <w:tcW w:w="869" w:type="dxa"/>
+            <w:tcW w:w="803" w:type="dxa"/>
             <w:vAlign w:val="center"/>
             <w:tcBorders>
               <w:top w:val="single" w:sz="8" w:color="000000"/>
@@ -549,7 +551,7 @@
         </w:tc>
         <w:tc>
           <w:tcPr>
-            <w:tcW w:w="869" w:type="dxa"/>
+            <w:tcW w:w="803" w:type="dxa"/>
             <w:vAlign w:val="center"/>
             <w:tcBorders>
               <w:top w:val="single" w:sz="8" w:color="000000"/>
@@ -578,7 +580,7 @@
         </w:tc>
         <w:tc>
           <w:tcPr>
-            <w:tcW w:w="869" w:type="dxa"/>
+            <w:tcW w:w="803" w:type="dxa"/>
             <w:vAlign w:val="center"/>
             <w:tcBorders>
               <w:top w:val="single" w:sz="8" w:color="000000"/>
@@ -607,7 +609,7 @@
         </w:tc>
         <w:tc>
           <w:tcPr>
-            <w:tcW w:w="869" w:type="dxa"/>
+            <w:tcW w:w="803" w:type="dxa"/>
             <w:vAlign w:val="center"/>
             <w:tcBorders>
               <w:top w:val="single" w:sz="8" w:color="000000"/>
@@ -636,17 +638,90 @@
         </w:tc>
         <w:tc>
           <w:tcPr>
-            <w:tcW w:w="1400" w:type="dxa"/>
-            <w:tcBorders>
-              <w:top w:val="single" w:sz="8" w:color="000000"/>
-              <w:left w:val="single" w:sz="8" w:color="000000"/>
-              <w:right w:val="single" w:sz="8" w:color="000000"/>
-              <w:bottom w:val="single" w:sz="8" w:color="000000"/>
-            </w:tcBorders>
-            <w:vMerge w:val="continue"/>
-            <w:noWrap/>
-          </w:tcPr>
-          <w:p/>
+            <w:tcW w:w="850" w:type="dxa"/>
+            <w:vAlign w:val="center"/>
+            <w:tcBorders>
+              <w:top w:val="single" w:sz="8" w:color="000000"/>
+              <w:left w:val="single" w:sz="8" w:color="000000"/>
+              <w:right w:val="single" w:sz="8" w:color="000000"/>
+              <w:bottom w:val="single" w:sz="8" w:color="000000"/>
+            </w:tcBorders>
+            <w:noWrap/>
+          </w:tcPr>
+          <w:p>
+            <w:pPr>
+              <w:jc w:val="center"/>
+              <w:spacing w:before="0" w:after="0"/>
+            </w:pPr>
+            <w:r>
+              <w:rPr>
+                <w:rFonts w:ascii="Times New Roman" w:hAnsi="Times New Roman" w:eastAsia="Times New Roman" w:cs="Times New Roman"/>
+                <w:sz w:val="20"/>
+                <w:szCs w:val="20"/>
+                <w:b w:val="0"/>
+                <w:bCs w:val="0"/>
+              </w:rPr>
+              <w:t xml:space="preserve">Biết</w:t>
+            </w:r>
+          </w:p>
+        </w:tc>
+        <w:tc>
+          <w:tcPr>
+            <w:tcW w:w="850" w:type="dxa"/>
+            <w:vAlign w:val="center"/>
+            <w:tcBorders>
+              <w:top w:val="single" w:sz="8" w:color="000000"/>
+              <w:left w:val="single" w:sz="8" w:color="000000"/>
+              <w:right w:val="single" w:sz="8" w:color="000000"/>
+              <w:bottom w:val="single" w:sz="8" w:color="000000"/>
+            </w:tcBorders>
+            <w:noWrap/>
+          </w:tcPr>
+          <w:p>
+            <w:pPr>
+              <w:jc w:val="center"/>
+              <w:spacing w:before="0" w:after="0"/>
+            </w:pPr>
+            <w:r>
+              <w:rPr>
+                <w:rFonts w:ascii="Times New Roman" w:hAnsi="Times New Roman" w:eastAsia="Times New Roman" w:cs="Times New Roman"/>
+                <w:sz w:val="20"/>
+                <w:szCs w:val="20"/>
+                <w:b w:val="0"/>
+                <w:bCs w:val="0"/>
+              </w:rPr>
+              <w:t xml:space="preserve">Hiểu</w:t>
+            </w:r>
+          </w:p>
+        </w:tc>
+        <w:tc>
+          <w:tcPr>
+            <w:tcW w:w="850" w:type="dxa"/>
+            <w:vAlign w:val="center"/>
+            <w:tcBorders>
+              <w:top w:val="single" w:sz="8" w:color="000000"/>
+              <w:left w:val="single" w:sz="8" w:color="000000"/>
+              <w:right w:val="single" w:sz="8" w:color="000000"/>
+              <w:bottom w:val="single" w:sz="8" w:color="000000"/>
+            </w:tcBorders>
+            <w:noWrap/>
+          </w:tcPr>
+          <w:p>
+            <w:pPr>
+              <w:jc w:val="center"/>
+              <w:spacing w:before="0" w:after="0"/>
+            </w:pPr>
+            <w:r>
+              <w:rPr>
+                <w:rFonts w:ascii="Times New Roman" w:hAnsi="Times New Roman" w:eastAsia="Times New Roman" w:cs="Times New Roman"/>
+                <w:sz w:val="20"/>
+                <w:szCs w:val="20"/>
+                <w:b w:val="0"/>
+                <w:bCs w:val="0"/>
+              </w:rPr>
+              <w:t xml:space="preserve">VD</w:t>
+            </w:r>
+          </w:p>
         </w:tc>
         <w:tc>
           <w:tcPr>
@@ -683,7 +758,7 @@
         </w:trPr>
         <w:tc>
           <w:tcPr>
-            <w:tcW w:w="3353" w:type="dxa"/>
+            <w:tcW w:w="2800" w:type="dxa"/>
             <w:vAlign w:val="center"/>
             <w:tcBorders>
               <w:top w:val="single" w:sz="8" w:color="000000"/>
@@ -728,7 +803,7 @@
         </w:tc>
         <w:tc>
           <w:tcPr>
-            <w:tcW w:w="870" w:type="dxa"/>
+            <w:tcW w:w="804" w:type="dxa"/>
             <w:vAlign w:val="center"/>
             <w:tcBorders>
               <w:top w:val="single" w:sz="8" w:color="000000"/>
@@ -757,7 +832,7 @@
         </w:tc>
         <w:tc>
           <w:tcPr>
-            <w:tcW w:w="870" w:type="dxa"/>
+            <w:tcW w:w="803" w:type="dxa"/>
             <w:vAlign w:val="center"/>
             <w:tcBorders>
               <w:top w:val="single" w:sz="8" w:color="000000"/>
@@ -786,7 +861,7 @@
         </w:tc>
         <w:tc>
           <w:tcPr>
-            <w:tcW w:w="870" w:type="dxa"/>
+            <w:tcW w:w="803" w:type="dxa"/>
             <w:vAlign w:val="center"/>
             <w:tcBorders>
               <w:top w:val="single" w:sz="8" w:color="000000"/>
@@ -815,7 +890,7 @@
         </w:tc>
         <w:tc>
           <w:tcPr>
-            <w:tcW w:w="870" w:type="dxa"/>
+            <w:tcW w:w="803" w:type="dxa"/>
             <w:vAlign w:val="center"/>
             <w:tcBorders>
               <w:top w:val="single" w:sz="8" w:color="000000"/>
@@ -844,7 +919,7 @@
         </w:tc>
         <w:tc>
           <w:tcPr>
-            <w:tcW w:w="869" w:type="dxa"/>
+            <w:tcW w:w="803" w:type="dxa"/>
             <w:vAlign w:val="center"/>
             <w:tcBorders>
               <w:top w:val="single" w:sz="8" w:color="000000"/>
@@ -873,7 +948,7 @@
         </w:tc>
         <w:tc>
           <w:tcPr>
-            <w:tcW w:w="869" w:type="dxa"/>
+            <w:tcW w:w="803" w:type="dxa"/>
             <w:vAlign w:val="center"/>
             <w:tcBorders>
               <w:top w:val="single" w:sz="8" w:color="000000"/>
@@ -902,7 +977,7 @@
         </w:tc>
         <w:tc>
           <w:tcPr>
-            <w:tcW w:w="869" w:type="dxa"/>
+            <w:tcW w:w="803" w:type="dxa"/>
             <w:vAlign w:val="center"/>
             <w:tcBorders>
               <w:top w:val="single" w:sz="8" w:color="000000"/>
@@ -931,7 +1006,7 @@
         </w:tc>
         <w:tc>
           <w:tcPr>
-            <w:tcW w:w="869" w:type="dxa"/>
+            <w:tcW w:w="803" w:type="dxa"/>
             <w:vAlign w:val="center"/>
             <w:tcBorders>
               <w:top w:val="single" w:sz="8" w:color="000000"/>
@@ -960,7 +1035,7 @@
         </w:tc>
         <w:tc>
           <w:tcPr>
-            <w:tcW w:w="869" w:type="dxa"/>
+            <w:tcW w:w="803" w:type="dxa"/>
             <w:vAlign w:val="center"/>
             <w:tcBorders>
               <w:top w:val="single" w:sz="8" w:color="000000"/>
@@ -989,7 +1064,7 @@
         </w:tc>
         <w:tc>
           <w:tcPr>
-            <w:tcW w:w="1400" w:type="dxa"/>
+            <w:tcW w:w="850" w:type="dxa"/>
             <w:vAlign w:val="center"/>
             <w:tcBorders>
               <w:top w:val="single" w:sz="8" w:color="000000"/>
@@ -1012,7 +1087,65 @@
                 <w:b w:val="0"/>
                 <w:bCs w:val="0"/>
               </w:rPr>
-              <w:t xml:space="preserve">${m_sum_cau}</w:t>
+              <w:t xml:space="preserve">${m_tong_nb}</w:t>
+            </w:r>
+          </w:p>
+        </w:tc>
+        <w:tc>
+          <w:tcPr>
+            <w:tcW w:w="850" w:type="dxa"/>
+            <w:vAlign w:val="center"/>
+            <w:tcBorders>
+              <w:top w:val="single" w:sz="8" w:color="000000"/>
+              <w:left w:val="single" w:sz="8" w:color="000000"/>
+              <w:right w:val="single" w:sz="8" w:color="000000"/>
+              <w:bottom w:val="single" w:sz="8" w:color="000000"/>
+            </w:tcBorders>
+            <w:noWrap/>
+          </w:tcPr>
+          <w:p>
+            <w:pPr>
+              <w:jc w:val="center"/>
+              <w:spacing w:before="0" w:after="0"/>
+            </w:pPr>
+            <w:r>
+              <w:rPr>
+                <w:rFonts w:ascii="Times New Roman" w:hAnsi="Times New Roman" w:eastAsia="Times New Roman" w:cs="Times New Roman"/>
+                <w:sz w:val="18"/>
+                <w:szCs w:val="18"/>
+                <w:b w:val="0"/>
+                <w:bCs w:val="0"/>
+              </w:rPr>
+              <w:t xml:space="preserve">${m_tong_th}</w:t>
+            </w:r>
+          </w:p>
+        </w:tc>
+        <w:tc>
+          <w:tcPr>
+            <w:tcW w:w="850" w:type="dxa"/>
+            <w:vAlign w:val="center"/>
+            <w:tcBorders>
+              <w:top w:val="single" w:sz="8" w:color="000000"/>
+              <w:left w:val="single" w:sz="8" w:color="000000"/>
+              <w:right w:val="single" w:sz="8" w:color="000000"/>
+              <w:bottom w:val="single" w:sz="8" w:color="000000"/>
+            </w:tcBorders>
+            <w:noWrap/>
+          </w:tcPr>
+          <w:p>
+            <w:pPr>
+              <w:jc w:val="center"/>
+              <w:spacing w:before="0" w:after="0"/>
+            </w:pPr>
+            <w:r>
+              <w:rPr>
+                <w:rFonts w:ascii="Times New Roman" w:hAnsi="Times New Roman" w:eastAsia="Times New Roman" w:cs="Times New Roman"/>
+                <w:sz w:val="18"/>
+                <w:szCs w:val="18"/>
+                <w:b w:val="0"/>
+                <w:bCs w:val="0"/>
+              </w:rPr>
+              <w:t xml:space="preserve">${m_tong_vd}</w:t>
             </w:r>
           </w:p>
         </w:tc>
@@ -1081,7 +1214,7 @@
         </w:trPr>
         <w:tc>
           <w:tcPr>
-            <w:tcW w:w="3353" w:type="dxa"/>
+            <w:tcW w:w="2800" w:type="dxa"/>
             <w:vAlign w:val="center"/>
             <w:tcBorders>
               <w:top w:val="single" w:sz="8" w:color="000000"/>
@@ -1110,7 +1243,7 @@
         </w:tc>
         <w:tc>
           <w:tcPr>
-            <w:tcW w:w="870" w:type="dxa"/>
+            <w:tcW w:w="804" w:type="dxa"/>
             <w:vAlign w:val="center"/>
             <w:tcBorders>
               <w:top w:val="single" w:sz="8" w:color="000000"/>
@@ -1139,7 +1272,7 @@
         </w:tc>
         <w:tc>
           <w:tcPr>
-            <w:tcW w:w="870" w:type="dxa"/>
+            <w:tcW w:w="803" w:type="dxa"/>
             <w:vAlign w:val="center"/>
             <w:tcBorders>
               <w:top w:val="single" w:sz="8" w:color="000000"/>
@@ -1168,7 +1301,7 @@
         </w:tc>
         <w:tc>
           <w:tcPr>
-            <w:tcW w:w="870" w:type="dxa"/>
+            <w:tcW w:w="803" w:type="dxa"/>
             <w:vAlign w:val="center"/>
             <w:tcBorders>
               <w:top w:val="single" w:sz="8" w:color="000000"/>
@@ -1197,7 +1330,7 @@
         </w:tc>
         <w:tc>
           <w:tcPr>
-            <w:tcW w:w="870" w:type="dxa"/>
+            <w:tcW w:w="803" w:type="dxa"/>
             <w:vAlign w:val="center"/>
             <w:tcBorders>
               <w:top w:val="single" w:sz="8" w:color="000000"/>
@@ -1226,7 +1359,7 @@
         </w:tc>
         <w:tc>
           <w:tcPr>
-            <w:tcW w:w="869" w:type="dxa"/>
+            <w:tcW w:w="803" w:type="dxa"/>
             <w:vAlign w:val="center"/>
             <w:tcBorders>
               <w:top w:val="single" w:sz="8" w:color="000000"/>
@@ -1255,7 +1388,7 @@
         </w:tc>
         <w:tc>
           <w:tcPr>
-            <w:tcW w:w="869" w:type="dxa"/>
+            <w:tcW w:w="803" w:type="dxa"/>
             <w:vAlign w:val="center"/>
             <w:tcBorders>
               <w:top w:val="single" w:sz="8" w:color="000000"/>
@@ -1284,7 +1417,7 @@
         </w:tc>
         <w:tc>
           <w:tcPr>
-            <w:tcW w:w="869" w:type="dxa"/>
+            <w:tcW w:w="803" w:type="dxa"/>
             <w:vAlign w:val="center"/>
             <w:tcBorders>
               <w:top w:val="single" w:sz="8" w:color="000000"/>
@@ -1313,7 +1446,7 @@
         </w:tc>
         <w:tc>
           <w:tcPr>
-            <w:tcW w:w="869" w:type="dxa"/>
+            <w:tcW w:w="803" w:type="dxa"/>
             <w:vAlign w:val="center"/>
             <w:tcBorders>
               <w:top w:val="single" w:sz="8" w:color="000000"/>
@@ -1342,7 +1475,7 @@
         </w:tc>
         <w:tc>
           <w:tcPr>
-            <w:tcW w:w="869" w:type="dxa"/>
+            <w:tcW w:w="803" w:type="dxa"/>
             <w:vAlign w:val="center"/>
             <w:tcBorders>
               <w:top w:val="single" w:sz="8" w:color="000000"/>
@@ -1371,31 +1504,117 @@
         </w:tc>
         <w:tc>
           <w:tcPr>
-            <w:tcW w:w="2800" w:type="dxa"/>
-            <w:vAlign w:val="center"/>
-            <w:tcBorders>
-              <w:top w:val="single" w:sz="8" w:color="000000"/>
-              <w:left w:val="single" w:sz="8" w:color="000000"/>
-              <w:right w:val="single" w:sz="8" w:color="000000"/>
-              <w:bottom w:val="single" w:sz="8" w:color="000000"/>
-            </w:tcBorders>
-            <w:gridSpan w:val="2"/>
-            <w:noWrap/>
-          </w:tcPr>
-          <w:p>
-            <w:pPr>
-              <w:jc w:val="center"/>
-              <w:spacing w:before="0" w:after="0"/>
-            </w:pPr>
-            <w:r>
-              <w:rPr>
-                <w:rFonts w:ascii="Times New Roman" w:hAnsi="Times New Roman" w:eastAsia="Times New Roman" w:cs="Times New Roman"/>
-                <w:sz w:val="20"/>
-                <w:szCs w:val="20"/>
-                <w:b w:val="1"/>
-                <w:bCs w:val="1"/>
-              </w:rPr>
-              <w:t xml:space="preserve">${m_t_tong}</w:t>
+            <w:tcW w:w="850" w:type="dxa"/>
+            <w:vAlign w:val="center"/>
+            <w:tcBorders>
+              <w:top w:val="single" w:sz="8" w:color="000000"/>
+              <w:left w:val="single" w:sz="8" w:color="000000"/>
+              <w:right w:val="single" w:sz="8" w:color="000000"/>
+              <w:bottom w:val="single" w:sz="8" w:color="000000"/>
+            </w:tcBorders>
+            <w:noWrap/>
+          </w:tcPr>
+          <w:p>
+            <w:pPr>
+              <w:jc w:val="center"/>
+              <w:spacing w:before="0" w:after="0"/>
+            </w:pPr>
+            <w:r>
+              <w:rPr>
+                <w:rFonts w:ascii="Times New Roman" w:hAnsi="Times New Roman" w:eastAsia="Times New Roman" w:cs="Times New Roman"/>
+                <w:sz w:val="20"/>
+                <w:szCs w:val="20"/>
+                <w:b w:val="1"/>
+                <w:bCs w:val="1"/>
+              </w:rPr>
+              <w:t xml:space="preserve">${m_t_tong_nb}</w:t>
+            </w:r>
+          </w:p>
+        </w:tc>
+        <w:tc>
+          <w:tcPr>
+            <w:tcW w:w="850" w:type="dxa"/>
+            <w:vAlign w:val="center"/>
+            <w:tcBorders>
+              <w:top w:val="single" w:sz="8" w:color="000000"/>
+              <w:left w:val="single" w:sz="8" w:color="000000"/>
+              <w:right w:val="single" w:sz="8" w:color="000000"/>
+              <w:bottom w:val="single" w:sz="8" w:color="000000"/>
+            </w:tcBorders>
+            <w:noWrap/>
+          </w:tcPr>
+          <w:p>
+            <w:pPr>
+              <w:jc w:val="center"/>
+              <w:spacing w:before="0" w:after="0"/>
+            </w:pPr>
+            <w:r>
+              <w:rPr>
+                <w:rFonts w:ascii="Times New Roman" w:hAnsi="Times New Roman" w:eastAsia="Times New Roman" w:cs="Times New Roman"/>
+                <w:sz w:val="20"/>
+                <w:szCs w:val="20"/>
+                <w:b w:val="1"/>
+                <w:bCs w:val="1"/>
+              </w:rPr>
+              <w:t xml:space="preserve">${m_t_tong_th}</w:t>
+            </w:r>
+          </w:p>
+        </w:tc>
+        <w:tc>
+          <w:tcPr>
+            <w:tcW w:w="850" w:type="dxa"/>
+            <w:vAlign w:val="center"/>
+            <w:tcBorders>
+              <w:top w:val="single" w:sz="8" w:color="000000"/>
+              <w:left w:val="single" w:sz="8" w:color="000000"/>
+              <w:right w:val="single" w:sz="8" w:color="000000"/>
+              <w:bottom w:val="single" w:sz="8" w:color="000000"/>
+            </w:tcBorders>
+            <w:noWrap/>
+          </w:tcPr>
+          <w:p>
+            <w:pPr>
+              <w:jc w:val="center"/>
+              <w:spacing w:before="0" w:after="0"/>
+            </w:pPr>
+            <w:r>
+              <w:rPr>
+                <w:rFonts w:ascii="Times New Roman" w:hAnsi="Times New Roman" w:eastAsia="Times New Roman" w:cs="Times New Roman"/>
+                <w:sz w:val="20"/>
+                <w:szCs w:val="20"/>
+                <w:b w:val="1"/>
+                <w:bCs w:val="1"/>
+              </w:rPr>
+              <w:t xml:space="preserve">${m_t_tong_vd}</w:t>
+            </w:r>
+          </w:p>
+        </w:tc>
+        <w:tc>
+          <w:tcPr>
+            <w:tcW w:w="1400" w:type="dxa"/>
+            <w:vAlign w:val="center"/>
+            <w:tcBorders>
+              <w:top w:val="single" w:sz="8" w:color="000000"/>
+              <w:left w:val="single" w:sz="8" w:color="000000"/>
+              <w:right w:val="single" w:sz="8" w:color="000000"/>
+              <w:bottom w:val="single" w:sz="8" w:color="000000"/>
+            </w:tcBorders>
+            <w:noWrap/>
+          </w:tcPr>
+          <w:p>
+            <w:pPr>
+              <w:jc w:val="center"/>
+              <w:spacing w:before="0" w:after="0"/>
+            </w:pPr>
+            <w:r>
+              <w:rPr>
+                <w:rFonts w:ascii="Times New Roman" w:hAnsi="Times New Roman" w:eastAsia="Times New Roman" w:cs="Times New Roman"/>
+                <w:sz w:val="20"/>
+                <w:szCs w:val="20"/>
+                <w:b w:val="1"/>
+                <w:bCs w:val="1"/>
+              </w:rPr>
+              <w:t xml:space="preserve"/>
             </w:r>
           </w:p>
         </w:tc>
@@ -1435,7 +1654,7 @@
         </w:trPr>
         <w:tc>
           <w:tcPr>
-            <w:tcW w:w="3353" w:type="dxa"/>
+            <w:tcW w:w="2800" w:type="dxa"/>
             <w:vAlign w:val="center"/>
             <w:tcBorders>
               <w:top w:val="single" w:sz="8" w:color="000000"/>
@@ -1464,7 +1683,7 @@
         </w:tc>
         <w:tc>
           <w:tcPr>
-            <w:tcW w:w="2610" w:type="dxa"/>
+            <w:tcW w:w="2410" w:type="dxa"/>
             <w:vAlign w:val="center"/>
             <w:tcBorders>
               <w:top w:val="single" w:sz="8" w:color="000000"/>
@@ -1494,7 +1713,7 @@
         </w:tc>
         <w:tc>
           <w:tcPr>
-            <w:tcW w:w="2608" w:type="dxa"/>
+            <w:tcW w:w="2409" w:type="dxa"/>
             <w:vAlign w:val="center"/>
             <w:tcBorders>
               <w:top w:val="single" w:sz="8" w:color="000000"/>
@@ -1524,7 +1743,7 @@
         </w:tc>
         <w:tc>
           <w:tcPr>
-            <w:tcW w:w="2607" w:type="dxa"/>
+            <w:tcW w:w="2409" w:type="dxa"/>
             <w:vAlign w:val="center"/>
             <w:tcBorders>
               <w:top w:val="single" w:sz="8" w:color="000000"/>
@@ -1554,15 +1773,15 @@
         </w:tc>
         <w:tc>
           <w:tcPr>
-            <w:tcW w:w="2800" w:type="dxa"/>
-            <w:vAlign w:val="center"/>
-            <w:tcBorders>
-              <w:top w:val="single" w:sz="8" w:color="000000"/>
-              <w:left w:val="single" w:sz="8" w:color="000000"/>
-              <w:right w:val="single" w:sz="8" w:color="000000"/>
-              <w:bottom w:val="single" w:sz="8" w:color="000000"/>
-            </w:tcBorders>
-            <w:gridSpan w:val="2"/>
+            <w:tcW w:w="3950" w:type="dxa"/>
+            <w:vAlign w:val="center"/>
+            <w:tcBorders>
+              <w:top w:val="single" w:sz="8" w:color="000000"/>
+              <w:left w:val="single" w:sz="8" w:color="000000"/>
+              <w:right w:val="single" w:sz="8" w:color="000000"/>
+              <w:bottom w:val="single" w:sz="8" w:color="000000"/>
+            </w:tcBorders>
+            <w:gridSpan w:val="4"/>
             <w:noWrap/>
           </w:tcPr>
           <w:p>
@@ -1618,7 +1837,7 @@
         </w:trPr>
         <w:tc>
           <w:tcPr>
-            <w:tcW w:w="3353" w:type="dxa"/>
+            <w:tcW w:w="2800" w:type="dxa"/>
             <w:vAlign w:val="center"/>
             <w:tcBorders>
               <w:top w:val="single" w:sz="8" w:color="000000"/>
@@ -1647,7 +1866,7 @@
         </w:tc>
         <w:tc>
           <w:tcPr>
-            <w:tcW w:w="2610" w:type="dxa"/>
+            <w:tcW w:w="2410" w:type="dxa"/>
             <w:vAlign w:val="center"/>
             <w:tcBorders>
               <w:top w:val="single" w:sz="8" w:color="000000"/>
@@ -1677,7 +1896,7 @@
         </w:tc>
         <w:tc>
           <w:tcPr>
-            <w:tcW w:w="2608" w:type="dxa"/>
+            <w:tcW w:w="2409" w:type="dxa"/>
             <w:vAlign w:val="center"/>
             <w:tcBorders>
               <w:top w:val="single" w:sz="8" w:color="000000"/>
@@ -1707,7 +1926,7 @@
         </w:tc>
         <w:tc>
           <w:tcPr>
-            <w:tcW w:w="2607" w:type="dxa"/>
+            <w:tcW w:w="2409" w:type="dxa"/>
             <w:vAlign w:val="center"/>
             <w:tcBorders>
               <w:top w:val="single" w:sz="8" w:color="000000"/>
@@ -1737,15 +1956,15 @@
         </w:tc>
         <w:tc>
           <w:tcPr>
-            <w:tcW w:w="2800" w:type="dxa"/>
-            <w:vAlign w:val="center"/>
-            <w:tcBorders>
-              <w:top w:val="single" w:sz="8" w:color="000000"/>
-              <w:left w:val="single" w:sz="8" w:color="000000"/>
-              <w:right w:val="single" w:sz="8" w:color="000000"/>
-              <w:bottom w:val="single" w:sz="8" w:color="000000"/>
-            </w:tcBorders>
-            <w:gridSpan w:val="2"/>
+            <w:tcW w:w="3950" w:type="dxa"/>
+            <w:vAlign w:val="center"/>
+            <w:tcBorders>
+              <w:top w:val="single" w:sz="8" w:color="000000"/>
+              <w:left w:val="single" w:sz="8" w:color="000000"/>
+              <w:right w:val="single" w:sz="8" w:color="000000"/>
+              <w:bottom w:val="single" w:sz="8" w:color="000000"/>
+            </w:tcBorders>
+            <w:gridSpan w:val="4"/>
             <w:noWrap/>
           </w:tcPr>
           <w:p>

</xml_diff>